<commit_message>
realizando o save do agendamento
</commit_message>
<xml_diff>
--- a/execução-projeto.docx
+++ b/execução-projeto.docx
@@ -318,6 +318,63 @@
           <w:rFonts w:ascii="Times New Roman" w:hAnsi="Times New Roman" w:cs="Times New Roman"/>
         </w:rPr>
         <w:t>Realizar Login e Logout</w:t>
+      </w:r>
+    </w:p>
+    <w:p>
+      <w:pPr>
+        <w:jc w:val="left"/>
+        <w:rPr>
+          <w:rFonts w:ascii="Times New Roman" w:hAnsi="Times New Roman" w:cs="Times New Roman"/>
+        </w:rPr>
+      </w:pPr>
+    </w:p>
+    <w:p>
+      <w:pPr>
+        <w:jc w:val="left"/>
+        <w:rPr>
+          <w:rFonts w:ascii="Times New Roman" w:hAnsi="Times New Roman" w:cs="Times New Roman"/>
+        </w:rPr>
+      </w:pPr>
+      <w:r>
+        <w:rPr>
+          <w:rFonts w:ascii="Times New Roman" w:hAnsi="Times New Roman" w:cs="Times New Roman"/>
+        </w:rPr>
+        <w:t>Resumo do que já foi feito.</w:t>
+      </w:r>
+    </w:p>
+    <w:p>
+      <w:pPr>
+        <w:jc w:val="left"/>
+        <w:rPr>
+          <w:rFonts w:ascii="Times New Roman" w:hAnsi="Times New Roman" w:cs="Times New Roman"/>
+        </w:rPr>
+      </w:pPr>
+      <w:r>
+        <w:rPr>
+          <w:rFonts w:ascii="Times New Roman" w:hAnsi="Times New Roman" w:cs="Times New Roman"/>
+        </w:rPr>
+        <w:t>Dia 28 de junho de 2026, O usuário pode realizar o cadastro e se manter autenticado.</w:t>
+      </w:r>
+      <w:r>
+        <w:rPr>
+          <w:rFonts w:ascii="Times New Roman" w:hAnsi="Times New Roman" w:cs="Times New Roman"/>
+        </w:rPr>
+        <w:br/>
+        <w:t>começando a realizar o cadastro de serviços, função do barbeiro.</w:t>
+      </w:r>
+    </w:p>
+    <w:p>
+      <w:pPr>
+        <w:jc w:val="left"/>
+        <w:rPr>
+          <w:rFonts w:ascii="Times New Roman" w:hAnsi="Times New Roman" w:cs="Times New Roman"/>
+        </w:rPr>
+      </w:pPr>
+      <w:r>
+        <w:rPr>
+          <w:rFonts w:ascii="Times New Roman" w:hAnsi="Times New Roman" w:cs="Times New Roman"/>
+        </w:rPr>
+        <w:t>Realizado o cadastro de serviços, próximo passo é a implementação de um agendamento.</w:t>
       </w:r>
     </w:p>
     <w:sectPr>

</xml_diff>

<commit_message>
alterações no DTO para Record
</commit_message>
<xml_diff>
--- a/execução-projeto.docx
+++ b/execução-projeto.docx
@@ -145,19 +145,7 @@
         <w:rPr>
           <w:rFonts w:ascii="Times New Roman" w:hAnsi="Times New Roman" w:cs="Times New Roman"/>
         </w:rPr>
-        <w:t xml:space="preserve">Usuário – </w:t>
-      </w:r>
-      <w:r>
-        <w:rPr>
-          <w:rFonts w:ascii="Times New Roman" w:hAnsi="Times New Roman" w:cs="Times New Roman"/>
-        </w:rPr>
-        <w:t>Barbeiro</w:t>
-      </w:r>
-      <w:r>
-        <w:rPr>
-          <w:rFonts w:ascii="Times New Roman" w:hAnsi="Times New Roman" w:cs="Times New Roman"/>
-        </w:rPr>
-        <w:t xml:space="preserve"> </w:t>
+        <w:t xml:space="preserve">Usuário – Barbeiro </w:t>
       </w:r>
     </w:p>
     <w:p>
@@ -375,6 +363,152 @@
           <w:rFonts w:ascii="Times New Roman" w:hAnsi="Times New Roman" w:cs="Times New Roman"/>
         </w:rPr>
         <w:t>Realizado o cadastro de serviços, próximo passo é a implementação de um agendamento.</w:t>
+      </w:r>
+    </w:p>
+    <w:p>
+      <w:pPr>
+        <w:jc w:val="left"/>
+        <w:rPr>
+          <w:rFonts w:ascii="Times New Roman" w:hAnsi="Times New Roman" w:cs="Times New Roman"/>
+        </w:rPr>
+      </w:pPr>
+      <w:r>
+        <w:rPr>
+          <w:rFonts w:ascii="Times New Roman" w:hAnsi="Times New Roman" w:cs="Times New Roman"/>
+        </w:rPr>
+        <w:t xml:space="preserve">Dia 02 de julho de 2026, realizando processo de agendamento. </w:t>
+      </w:r>
+    </w:p>
+    <w:p>
+      <w:pPr>
+        <w:jc w:val="left"/>
+        <w:rPr>
+          <w:rFonts w:ascii="Times New Roman" w:hAnsi="Times New Roman" w:cs="Times New Roman"/>
+        </w:rPr>
+      </w:pPr>
+      <w:r>
+        <w:rPr>
+          <w:rFonts w:ascii="Times New Roman" w:hAnsi="Times New Roman" w:cs="Times New Roman"/>
+        </w:rPr>
+        <w:t xml:space="preserve">Informações a serem salvas no banco – IMPLEMENTAR </w:t>
+      </w:r>
+    </w:p>
+    <w:p>
+      <w:pPr>
+        <w:jc w:val="left"/>
+        <w:rPr>
+          <w:rFonts w:ascii="Times New Roman" w:hAnsi="Times New Roman" w:cs="Times New Roman"/>
+        </w:rPr>
+      </w:pPr>
+      <w:r>
+        <w:rPr>
+          <w:rFonts w:ascii="Times New Roman" w:hAnsi="Times New Roman" w:cs="Times New Roman"/>
+        </w:rPr>
+        <w:t xml:space="preserve">ENTITY, DAO, BO E DTO do mesmo. Realizando o </w:t>
+      </w:r>
+      <w:proofErr w:type="spellStart"/>
+      <w:r>
+        <w:rPr>
+          <w:rFonts w:ascii="Times New Roman" w:hAnsi="Times New Roman" w:cs="Times New Roman"/>
+        </w:rPr>
+        <w:t>save</w:t>
+      </w:r>
+      <w:proofErr w:type="spellEnd"/>
+      <w:r>
+        <w:rPr>
+          <w:rFonts w:ascii="Times New Roman" w:hAnsi="Times New Roman" w:cs="Times New Roman"/>
+        </w:rPr>
+        <w:t xml:space="preserve"> de agendamento. Observação, deve ter um serviço acoplado. </w:t>
+      </w:r>
+    </w:p>
+    <w:p>
+      <w:pPr>
+        <w:jc w:val="left"/>
+        <w:rPr>
+          <w:rFonts w:ascii="Times New Roman" w:hAnsi="Times New Roman" w:cs="Times New Roman"/>
+        </w:rPr>
+      </w:pPr>
+      <w:r>
+        <w:rPr>
+          <w:rFonts w:ascii="Times New Roman" w:hAnsi="Times New Roman" w:cs="Times New Roman"/>
+        </w:rPr>
+        <w:t xml:space="preserve">Foram realizados, </w:t>
+      </w:r>
+      <w:proofErr w:type="gramStart"/>
+      <w:r>
+        <w:rPr>
+          <w:rFonts w:ascii="Times New Roman" w:hAnsi="Times New Roman" w:cs="Times New Roman"/>
+        </w:rPr>
+        <w:t>porem</w:t>
+      </w:r>
+      <w:proofErr w:type="gramEnd"/>
+      <w:r>
+        <w:rPr>
+          <w:rFonts w:ascii="Times New Roman" w:hAnsi="Times New Roman" w:cs="Times New Roman"/>
+        </w:rPr>
+        <w:t xml:space="preserve"> o valor que está sendo transportado não </w:t>
+      </w:r>
+      <w:proofErr w:type="gramStart"/>
+      <w:r>
+        <w:rPr>
+          <w:rFonts w:ascii="Times New Roman" w:hAnsi="Times New Roman" w:cs="Times New Roman"/>
+        </w:rPr>
+        <w:t>esta</w:t>
+      </w:r>
+      <w:proofErr w:type="gramEnd"/>
+      <w:r>
+        <w:rPr>
+          <w:rFonts w:ascii="Times New Roman" w:hAnsi="Times New Roman" w:cs="Times New Roman"/>
+        </w:rPr>
+        <w:t xml:space="preserve"> sendo salvo, </w:t>
+      </w:r>
+      <w:proofErr w:type="gramStart"/>
+      <w:r>
+        <w:rPr>
+          <w:rFonts w:ascii="Times New Roman" w:hAnsi="Times New Roman" w:cs="Times New Roman"/>
+        </w:rPr>
+        <w:t>esta</w:t>
+      </w:r>
+      <w:proofErr w:type="gramEnd"/>
+      <w:r>
+        <w:rPr>
+          <w:rFonts w:ascii="Times New Roman" w:hAnsi="Times New Roman" w:cs="Times New Roman"/>
+        </w:rPr>
+        <w:t xml:space="preserve"> retornando </w:t>
+      </w:r>
+      <w:proofErr w:type="spellStart"/>
+      <w:r>
+        <w:rPr>
+          <w:rFonts w:ascii="Times New Roman" w:hAnsi="Times New Roman" w:cs="Times New Roman"/>
+        </w:rPr>
+        <w:t>null</w:t>
+      </w:r>
+      <w:proofErr w:type="spellEnd"/>
+      <w:r>
+        <w:rPr>
+          <w:rFonts w:ascii="Times New Roman" w:hAnsi="Times New Roman" w:cs="Times New Roman"/>
+        </w:rPr>
+        <w:t>. Verificar se possível.</w:t>
+      </w:r>
+    </w:p>
+    <w:p>
+      <w:pPr>
+        <w:jc w:val="left"/>
+        <w:rPr>
+          <w:rFonts w:ascii="Times New Roman" w:hAnsi="Times New Roman" w:cs="Times New Roman"/>
+        </w:rPr>
+      </w:pPr>
+      <w:r>
+        <w:rPr>
+          <w:rFonts w:ascii="Times New Roman" w:hAnsi="Times New Roman" w:cs="Times New Roman"/>
+        </w:rPr>
+        <w:t>---</w:t>
+      </w:r>
+      <w:r>
+        <w:rPr>
+          <w:rFonts w:ascii="Times New Roman" w:hAnsi="Times New Roman" w:cs="Times New Roman"/>
+        </w:rPr>
+        <w:t xml:space="preserve"> </w:t>
       </w:r>
     </w:p>
     <w:sectPr>

</xml_diff>